<commit_message>
Update phone number to +1 307 247 8135 across all documents
Co-Authored-By: Claude Sonnet 5.5 <noreply@anthropic.com>
Claude-Session: https://claude.ai/code/session_01DFo29tTCUxjQWejnLXZyRx
</commit_message>
<xml_diff>
--- a/letterhead/ParaTech-Company-Profile-Acknowledgement.docx
+++ b/letterhead/ParaTech-Company-Profile-Acknowledgement.docx
@@ -183,7 +183,7 @@
           <w:sz w:val="20"/>
           <w:szCs w:val="20"/>
         </w:rPr>
-        <w:t xml:space="preserve">Website: www.paratechsolutions.com  ·  Email: contact@paratechsolutions.com  ·  Phone: +92 331 3313567</w:t>
+        <w:t xml:space="preserve">Website: www.paratechsolutions.com  ·  Email: contact@paratechsolutions.com  ·  Phone: +1 307 247 8135</w:t>
       </w:r>
     </w:p>
     <w:p>
@@ -1111,7 +1111,7 @@
               <w:sz w:val="16"/>
               <w:szCs w:val="16"/>
             </w:rPr>
-            <w:t xml:space="preserve">+92 331 3313567</w:t>
+            <w:t xml:space="preserve">+1 307 247 8135</w:t>
           </w:r>
         </w:p>
         <w:p>

</xml_diff>